<commit_message>
Delete suggestion and add Like/DisLike
</commit_message>
<xml_diff>
--- a/Документация/База данных.docx
+++ b/Документация/База данных.docx
@@ -4,49 +4,47 @@
   <w:body>
     <w:p>
       <w:r>
-        <w:t>-- ============================================</w:t>
-      </w:r>
-    </w:p>
-    <w:p>
-      <w:r>
-        <w:t xml:space="preserve">-- </w:t>
-      </w:r>
-      <w:proofErr w:type="spellStart"/>
-      <w:r>
-        <w:t>FitMaster</w:t>
-      </w:r>
-      <w:proofErr w:type="spellEnd"/>
-      <w:r>
-        <w:t xml:space="preserve"> – Полная схема базы данных (v5.0)</w:t>
-      </w:r>
-    </w:p>
-    <w:p>
-      <w:r>
-        <w:t xml:space="preserve">-- </w:t>
-      </w:r>
-      <w:proofErr w:type="spellStart"/>
-      <w:r>
-        <w:t>PostgreSQL</w:t>
-      </w:r>
-      <w:proofErr w:type="spellEnd"/>
-      <w:r>
-        <w:t xml:space="preserve"> – </w:t>
-      </w:r>
-      <w:proofErr w:type="spellStart"/>
+        <w:t>-- =====================================================</w:t>
+      </w:r>
+    </w:p>
+    <w:p>
+      <w:r>
+        <w:t>-- FitMaster – Полная схема базы данных (с дропом всех таблиц)</w:t>
+      </w:r>
+    </w:p>
+    <w:p>
+      <w:r>
+        <w:t>-- PostgreSQL</w:t>
+      </w:r>
+      <w:r>
+        <w:t xml:space="preserve"> - </w:t>
+      </w:r>
       <w:r>
         <w:t>fitmaster_db</w:t>
       </w:r>
-      <w:proofErr w:type="spellEnd"/>
-    </w:p>
-    <w:p>
-      <w:r>
-        <w:t>-- ============================================</w:t>
+    </w:p>
+    <w:p>
+      <w:r>
+        <w:t>-- =====================================================</w:t>
       </w:r>
     </w:p>
     <w:p/>
     <w:p>
       <w:r>
-        <w:t>-- 1. Удаляем все таблицы, если они существуют</w:t>
+        <w:t>-- 1. Удаление всех таблиц (CASCADE автоматически удалит зависимости)</w:t>
+      </w:r>
+    </w:p>
+    <w:p>
+      <w:pPr>
+        <w:rPr>
+          <w:lang w:val="en-US"/>
+        </w:rPr>
+      </w:pPr>
+      <w:r>
+        <w:rPr>
+          <w:lang w:val="en-US"/>
+        </w:rPr>
+        <w:t>DROP TABLE IF EXISTS exercise_likes CASCADE;</w:t>
       </w:r>
     </w:p>
     <w:p>
@@ -198,52 +196,10 @@
           <w:lang w:val="en-US"/>
         </w:rPr>
       </w:pPr>
-      <w:r>
-        <w:rPr>
-          <w:lang w:val="en-US"/>
-        </w:rPr>
-        <w:t xml:space="preserve">DROP TABLE IF EXISTS workout_results CASCADE;  -- </w:t>
-      </w:r>
-      <w:r>
-        <w:t>не</w:t>
-      </w:r>
-      <w:r>
-        <w:rPr>
-          <w:lang w:val="en-US"/>
-        </w:rPr>
-        <w:t xml:space="preserve"> </w:t>
-      </w:r>
-      <w:r>
-        <w:t>используется</w:t>
-      </w:r>
-      <w:r>
-        <w:rPr>
-          <w:lang w:val="en-US"/>
-        </w:rPr>
-        <w:t xml:space="preserve">, </w:t>
-      </w:r>
-      <w:r>
-        <w:t>удаляем</w:t>
-      </w:r>
-    </w:p>
-    <w:p>
-      <w:pPr>
-        <w:rPr>
-          <w:lang w:val="en-US"/>
-        </w:rPr>
-      </w:pPr>
-    </w:p>
-    <w:p>
-      <w:pPr>
-        <w:rPr>
-          <w:lang w:val="en-US"/>
-        </w:rPr>
-      </w:pPr>
-      <w:r>
-        <w:rPr>
-          <w:lang w:val="en-US"/>
-        </w:rPr>
-        <w:t>-- 2. ENUM TYPES</w:t>
+    </w:p>
+    <w:p>
+      <w:r>
+        <w:t>-- 2. ENUM типы (создаются только если отсутствуют)</w:t>
       </w:r>
     </w:p>
     <w:p>
@@ -593,100 +549,34 @@
       </w:r>
     </w:p>
     <w:p>
-      <w:pPr>
-        <w:rPr>
-          <w:lang w:val="en-US"/>
-        </w:rPr>
-      </w:pPr>
-      <w:r>
-        <w:rPr>
-          <w:lang w:val="en-US"/>
-        </w:rPr>
+      <w:r>
         <w:t>END $$;</w:t>
       </w:r>
     </w:p>
-    <w:p>
-      <w:pPr>
-        <w:rPr>
-          <w:lang w:val="en-US"/>
-        </w:rPr>
-      </w:pPr>
-    </w:p>
-    <w:p>
-      <w:pPr>
-        <w:rPr>
-          <w:lang w:val="en-US"/>
-        </w:rPr>
-      </w:pPr>
-      <w:r>
-        <w:rPr>
-          <w:lang w:val="en-US"/>
-        </w:rPr>
-        <w:t>-- ============================================</w:t>
-      </w:r>
-    </w:p>
-    <w:p>
-      <w:pPr>
-        <w:rPr>
-          <w:lang w:val="en-US"/>
-        </w:rPr>
-      </w:pPr>
-      <w:r>
-        <w:rPr>
-          <w:lang w:val="en-US"/>
-        </w:rPr>
-        <w:t xml:space="preserve">-- 3. </w:t>
-      </w:r>
-      <w:r>
-        <w:t>ТАБЛИЦЫ</w:t>
-      </w:r>
-    </w:p>
-    <w:p>
-      <w:pPr>
-        <w:rPr>
-          <w:lang w:val="en-US"/>
-        </w:rPr>
-      </w:pPr>
-      <w:r>
-        <w:rPr>
-          <w:lang w:val="en-US"/>
-        </w:rPr>
-        <w:t>-- ============================================</w:t>
-      </w:r>
-    </w:p>
-    <w:p>
-      <w:pPr>
-        <w:rPr>
-          <w:lang w:val="en-US"/>
-        </w:rPr>
-      </w:pPr>
-    </w:p>
-    <w:p>
-      <w:pPr>
-        <w:rPr>
-          <w:lang w:val="en-US"/>
-        </w:rPr>
-      </w:pPr>
-      <w:r>
-        <w:rPr>
-          <w:lang w:val="en-US"/>
-        </w:rPr>
-        <w:t xml:space="preserve">-- </w:t>
-      </w:r>
-      <w:r>
-        <w:t>Пользователи</w:t>
-      </w:r>
-    </w:p>
-    <w:p>
-      <w:pPr>
-        <w:rPr>
-          <w:lang w:val="en-US"/>
-        </w:rPr>
-      </w:pPr>
-      <w:r>
-        <w:rPr>
-          <w:lang w:val="en-US"/>
-        </w:rPr>
+    <w:p/>
+    <w:p>
+      <w:r>
+        <w:t>-- =====================================================</w:t>
+      </w:r>
+    </w:p>
+    <w:p>
+      <w:r>
+        <w:t>-- 3. СОЗДАНИЕ ТАБЛИЦ</w:t>
+      </w:r>
+    </w:p>
+    <w:p>
+      <w:r>
+        <w:t>-- =====================================================</w:t>
+      </w:r>
+    </w:p>
+    <w:p/>
+    <w:p>
+      <w:r>
+        <w:t>-- Пользователи</w:t>
+      </w:r>
+    </w:p>
+    <w:p>
+      <w:r>
         <w:t>CREATE TABLE users (</w:t>
       </w:r>
     </w:p>
@@ -697,10 +587,13 @@
         </w:rPr>
       </w:pPr>
       <w:r>
-        <w:rPr>
-          <w:lang w:val="en-US"/>
-        </w:rPr>
-        <w:t xml:space="preserve">    id SERIAL PRIMARY KEY,</w:t>
+        <w:t xml:space="preserve">    </w:t>
+      </w:r>
+      <w:r>
+        <w:rPr>
+          <w:lang w:val="en-US"/>
+        </w:rPr>
+        <w:t>id SERIAL PRIMARY KEY,</w:t>
       </w:r>
     </w:p>
     <w:p>
@@ -1902,14 +1795,48 @@
       </w:r>
     </w:p>
     <w:p>
-      <w:r>
+      <w:pPr>
+        <w:rPr>
+          <w:lang w:val="en-US"/>
+        </w:rPr>
+      </w:pPr>
+      <w:r>
+        <w:rPr>
+          <w:lang w:val="en-US"/>
+        </w:rPr>
         <w:t>);</w:t>
       </w:r>
     </w:p>
-    <w:p/>
-    <w:p>
-      <w:r>
-        <w:t>-- Метрики подходов (сколько повторений / вес / время)</w:t>
+    <w:p>
+      <w:pPr>
+        <w:rPr>
+          <w:lang w:val="en-US"/>
+        </w:rPr>
+      </w:pPr>
+    </w:p>
+    <w:p>
+      <w:pPr>
+        <w:rPr>
+          <w:lang w:val="en-US"/>
+        </w:rPr>
+      </w:pPr>
+      <w:r>
+        <w:rPr>
+          <w:lang w:val="en-US"/>
+        </w:rPr>
+        <w:t xml:space="preserve">-- </w:t>
+      </w:r>
+      <w:r>
+        <w:t>Метрики</w:t>
+      </w:r>
+      <w:r>
+        <w:rPr>
+          <w:lang w:val="en-US"/>
+        </w:rPr>
+        <w:t xml:space="preserve"> </w:t>
+      </w:r>
+      <w:r>
+        <w:t>подходов</w:t>
       </w:r>
     </w:p>
     <w:p>
@@ -2227,15 +2154,7 @@
     </w:p>
     <w:p>
       <w:r>
-        <w:t xml:space="preserve">CREATE TABLE </w:t>
-      </w:r>
-      <w:proofErr w:type="spellStart"/>
-      <w:r>
-        <w:t>fatigue_recovery</w:t>
-      </w:r>
-      <w:proofErr w:type="spellEnd"/>
-      <w:r>
-        <w:t xml:space="preserve"> (</w:t>
+        <w:t>CREATE TABLE fatigue_recovery (</w:t>
       </w:r>
     </w:p>
     <w:p>
@@ -2366,23 +2285,7 @@
         <w:t xml:space="preserve">    </w:t>
       </w:r>
       <w:r>
-        <w:t>UNIQUE(</w:t>
-      </w:r>
-      <w:proofErr w:type="spellStart"/>
-      <w:r>
-        <w:t>user_id</w:t>
-      </w:r>
-      <w:proofErr w:type="spellEnd"/>
-      <w:r>
-        <w:t xml:space="preserve">, </w:t>
-      </w:r>
-      <w:proofErr w:type="spellStart"/>
-      <w:r>
-        <w:t>date</w:t>
-      </w:r>
-      <w:proofErr w:type="spellEnd"/>
-      <w:r>
-        <w:t>)</w:t>
+        <w:t>UNIQUE(user_id, date)</w:t>
       </w:r>
     </w:p>
     <w:p>
@@ -2502,36 +2405,151 @@
       </w:r>
     </w:p>
     <w:p>
-      <w:pPr>
-        <w:rPr>
-          <w:lang w:val="en-US"/>
-        </w:rPr>
-      </w:pPr>
-      <w:r>
-        <w:rPr>
-          <w:lang w:val="en-US"/>
-        </w:rPr>
+      <w:r>
         <w:t>);</w:t>
       </w:r>
     </w:p>
-    <w:p>
-      <w:pPr>
-        <w:rPr>
-          <w:lang w:val="en-US"/>
-        </w:rPr>
-      </w:pPr>
-    </w:p>
-    <w:p>
-      <w:pPr>
-        <w:rPr>
-          <w:lang w:val="en-US"/>
-        </w:rPr>
-      </w:pPr>
-      <w:r>
-        <w:rPr>
-          <w:lang w:val="en-US"/>
-        </w:rPr>
-        <w:t>-- ============================================</w:t>
+    <w:p/>
+    <w:p>
+      <w:r>
+        <w:t>-- Лайки / дизлайки упражнений (новая таблица)</w:t>
+      </w:r>
+    </w:p>
+    <w:p>
+      <w:pPr>
+        <w:rPr>
+          <w:lang w:val="en-US"/>
+        </w:rPr>
+      </w:pPr>
+      <w:r>
+        <w:rPr>
+          <w:lang w:val="en-US"/>
+        </w:rPr>
+        <w:t>CREATE TABLE exercise_likes (</w:t>
+      </w:r>
+    </w:p>
+    <w:p>
+      <w:pPr>
+        <w:rPr>
+          <w:lang w:val="en-US"/>
+        </w:rPr>
+      </w:pPr>
+      <w:r>
+        <w:rPr>
+          <w:lang w:val="en-US"/>
+        </w:rPr>
+        <w:t xml:space="preserve">    id SERIAL PRIMARY KEY,</w:t>
+      </w:r>
+    </w:p>
+    <w:p>
+      <w:pPr>
+        <w:rPr>
+          <w:lang w:val="en-US"/>
+        </w:rPr>
+      </w:pPr>
+      <w:r>
+        <w:rPr>
+          <w:lang w:val="en-US"/>
+        </w:rPr>
+        <w:t xml:space="preserve">    user_id INTEGER NOT NULL REFERENCES users(id) ON DELETE CASCADE,</w:t>
+      </w:r>
+    </w:p>
+    <w:p>
+      <w:pPr>
+        <w:rPr>
+          <w:lang w:val="en-US"/>
+        </w:rPr>
+      </w:pPr>
+      <w:r>
+        <w:rPr>
+          <w:lang w:val="en-US"/>
+        </w:rPr>
+        <w:t xml:space="preserve">    exercise_id INTEGER NOT NULL REFERENCES exercises(id) ON DELETE CASCADE,</w:t>
+      </w:r>
+    </w:p>
+    <w:p>
+      <w:pPr>
+        <w:rPr>
+          <w:lang w:val="en-US"/>
+        </w:rPr>
+      </w:pPr>
+      <w:r>
+        <w:rPr>
+          <w:lang w:val="en-US"/>
+        </w:rPr>
+        <w:t xml:space="preserve">    liked BOOLEAN NOT NULL,</w:t>
+      </w:r>
+    </w:p>
+    <w:p>
+      <w:pPr>
+        <w:rPr>
+          <w:lang w:val="en-US"/>
+        </w:rPr>
+      </w:pPr>
+      <w:r>
+        <w:rPr>
+          <w:lang w:val="en-US"/>
+        </w:rPr>
+        <w:t xml:space="preserve">    created_at TIMESTAMP DEFAULT CURRENT_TIMESTAMP,</w:t>
+      </w:r>
+    </w:p>
+    <w:p>
+      <w:pPr>
+        <w:rPr>
+          <w:lang w:val="en-US"/>
+        </w:rPr>
+      </w:pPr>
+      <w:r>
+        <w:rPr>
+          <w:lang w:val="en-US"/>
+        </w:rPr>
+        <w:t xml:space="preserve">    updated_at TIMESTAMP DEFAULT CURRENT_TIMESTAMP,</w:t>
+      </w:r>
+    </w:p>
+    <w:p>
+      <w:pPr>
+        <w:rPr>
+          <w:lang w:val="en-US"/>
+        </w:rPr>
+      </w:pPr>
+      <w:r>
+        <w:rPr>
+          <w:lang w:val="en-US"/>
+        </w:rPr>
+        <w:t xml:space="preserve">    UNIQUE(user_id, exercise_id)</w:t>
+      </w:r>
+    </w:p>
+    <w:p>
+      <w:pPr>
+        <w:rPr>
+          <w:lang w:val="en-US"/>
+        </w:rPr>
+      </w:pPr>
+      <w:r>
+        <w:rPr>
+          <w:lang w:val="en-US"/>
+        </w:rPr>
+        <w:t>);</w:t>
+      </w:r>
+    </w:p>
+    <w:p>
+      <w:pPr>
+        <w:rPr>
+          <w:lang w:val="en-US"/>
+        </w:rPr>
+      </w:pPr>
+    </w:p>
+    <w:p>
+      <w:pPr>
+        <w:rPr>
+          <w:lang w:val="en-US"/>
+        </w:rPr>
+      </w:pPr>
+      <w:r>
+        <w:rPr>
+          <w:lang w:val="en-US"/>
+        </w:rPr>
+        <w:t>-- =====================================================</w:t>
       </w:r>
     </w:p>
     <w:p>
@@ -2560,7 +2578,7 @@
         <w:rPr>
           <w:lang w:val="en-US"/>
         </w:rPr>
-        <w:t>-- ============================================</w:t>
+        <w:t>-- =====================================================</w:t>
       </w:r>
     </w:p>
     <w:p>
@@ -2677,6 +2695,7 @@
         <w:rPr>
           <w:lang w:val="en-US"/>
         </w:rPr>
+        <w:lastRenderedPageBreak/>
         <w:t>CREATE INDEX idx_workout_adaptations_exercise_id ON workout_adaptations(exercise_id);</w:t>
       </w:r>
     </w:p>
@@ -2751,18 +2770,44 @@
           <w:lang w:val="en-US"/>
         </w:rPr>
       </w:pPr>
-    </w:p>
-    <w:p>
-      <w:pPr>
-        <w:rPr>
-          <w:lang w:val="en-US"/>
-        </w:rPr>
-      </w:pPr>
-      <w:r>
-        <w:rPr>
-          <w:lang w:val="en-US"/>
-        </w:rPr>
-        <w:t>-- ============================================</w:t>
+      <w:r>
+        <w:rPr>
+          <w:lang w:val="en-US"/>
+        </w:rPr>
+        <w:t>CREATE INDEX idx_exercise_likes_user ON exercise_likes(user_id);</w:t>
+      </w:r>
+    </w:p>
+    <w:p>
+      <w:pPr>
+        <w:rPr>
+          <w:lang w:val="en-US"/>
+        </w:rPr>
+      </w:pPr>
+      <w:r>
+        <w:rPr>
+          <w:lang w:val="en-US"/>
+        </w:rPr>
+        <w:t>CREATE INDEX idx_exercise_likes_exercise ON exercise_likes(exercise_id);</w:t>
+      </w:r>
+    </w:p>
+    <w:p>
+      <w:pPr>
+        <w:rPr>
+          <w:lang w:val="en-US"/>
+        </w:rPr>
+      </w:pPr>
+    </w:p>
+    <w:p>
+      <w:pPr>
+        <w:rPr>
+          <w:lang w:val="en-US"/>
+        </w:rPr>
+      </w:pPr>
+      <w:r>
+        <w:rPr>
+          <w:lang w:val="en-US"/>
+        </w:rPr>
+        <w:t>-- =====================================================</w:t>
       </w:r>
     </w:p>
     <w:p>
@@ -2787,7 +2832,7 @@
         <w:t xml:space="preserve"> </w:t>
       </w:r>
       <w:r>
-        <w:t>для</w:t>
+        <w:t>ДЛЯ</w:t>
       </w:r>
       <w:r>
         <w:rPr>
@@ -2806,7 +2851,187 @@
         <w:rPr>
           <w:lang w:val="en-US"/>
         </w:rPr>
-        <w:t>-- ============================================</w:t>
+        <w:t>-- =====================================================</w:t>
+      </w:r>
+    </w:p>
+    <w:p>
+      <w:pPr>
+        <w:rPr>
+          <w:lang w:val="en-US"/>
+        </w:rPr>
+      </w:pPr>
+      <w:r>
+        <w:rPr>
+          <w:lang w:val="en-US"/>
+        </w:rPr>
+        <w:t>CREATE OR REPLACE FUNCTION update_updated_at_column()</w:t>
+      </w:r>
+    </w:p>
+    <w:p>
+      <w:pPr>
+        <w:rPr>
+          <w:lang w:val="en-US"/>
+        </w:rPr>
+      </w:pPr>
+      <w:r>
+        <w:rPr>
+          <w:lang w:val="en-US"/>
+        </w:rPr>
+        <w:t>RETURNS TRIGGER AS $$</w:t>
+      </w:r>
+    </w:p>
+    <w:p>
+      <w:pPr>
+        <w:rPr>
+          <w:lang w:val="en-US"/>
+        </w:rPr>
+      </w:pPr>
+      <w:r>
+        <w:rPr>
+          <w:lang w:val="en-US"/>
+        </w:rPr>
+        <w:t>BEGIN</w:t>
+      </w:r>
+    </w:p>
+    <w:p>
+      <w:pPr>
+        <w:rPr>
+          <w:lang w:val="en-US"/>
+        </w:rPr>
+      </w:pPr>
+      <w:r>
+        <w:rPr>
+          <w:lang w:val="en-US"/>
+        </w:rPr>
+        <w:t xml:space="preserve">    NEW.updated_at = CURRENT_TIMESTAMP;</w:t>
+      </w:r>
+    </w:p>
+    <w:p>
+      <w:pPr>
+        <w:rPr>
+          <w:lang w:val="en-US"/>
+        </w:rPr>
+      </w:pPr>
+      <w:r>
+        <w:rPr>
+          <w:lang w:val="en-US"/>
+        </w:rPr>
+        <w:t xml:space="preserve">    RETURN NEW;</w:t>
+      </w:r>
+    </w:p>
+    <w:p>
+      <w:pPr>
+        <w:rPr>
+          <w:lang w:val="en-US"/>
+        </w:rPr>
+      </w:pPr>
+      <w:r>
+        <w:rPr>
+          <w:lang w:val="en-US"/>
+        </w:rPr>
+        <w:t>END;</w:t>
+      </w:r>
+    </w:p>
+    <w:p>
+      <w:pPr>
+        <w:rPr>
+          <w:lang w:val="en-US"/>
+        </w:rPr>
+      </w:pPr>
+      <w:r>
+        <w:rPr>
+          <w:lang w:val="en-US"/>
+        </w:rPr>
+        <w:t>$$ LANGUAGE 'plpgsql';</w:t>
+      </w:r>
+    </w:p>
+    <w:p>
+      <w:pPr>
+        <w:rPr>
+          <w:lang w:val="en-US"/>
+        </w:rPr>
+      </w:pPr>
+    </w:p>
+    <w:p>
+      <w:pPr>
+        <w:rPr>
+          <w:lang w:val="en-US"/>
+        </w:rPr>
+      </w:pPr>
+      <w:r>
+        <w:rPr>
+          <w:lang w:val="en-US"/>
+        </w:rPr>
+        <w:t>CREATE TRIGGER update_users_updated_at BEFORE UPDATE ON users FOR EACH ROW EXECUTE FUNCTION update_updated_at_column();</w:t>
+      </w:r>
+    </w:p>
+    <w:p>
+      <w:pPr>
+        <w:rPr>
+          <w:lang w:val="en-US"/>
+        </w:rPr>
+      </w:pPr>
+      <w:r>
+        <w:rPr>
+          <w:lang w:val="en-US"/>
+        </w:rPr>
+        <w:t>CREATE TRIGGER update_workouts_updated_at BEFORE UPDATE ON workouts FOR EACH ROW EXECUTE FUNCTION update_updated_at_column();</w:t>
+      </w:r>
+    </w:p>
+    <w:p>
+      <w:pPr>
+        <w:rPr>
+          <w:lang w:val="en-US"/>
+        </w:rPr>
+      </w:pPr>
+      <w:r>
+        <w:rPr>
+          <w:lang w:val="en-US"/>
+        </w:rPr>
+        <w:t>CREATE TRIGGER update_exercises_updated_at BEFORE UPDATE ON exercises FOR EACH ROW EXECUTE FUNCTION update_updated_at_column();</w:t>
+      </w:r>
+    </w:p>
+    <w:p>
+      <w:pPr>
+        <w:rPr>
+          <w:lang w:val="en-US"/>
+        </w:rPr>
+      </w:pPr>
+      <w:r>
+        <w:rPr>
+          <w:lang w:val="en-US"/>
+        </w:rPr>
+        <w:t>CREATE TRIGGER update_user_workouts_updated_at BEFORE UPDATE ON user_workouts FOR EACH ROW EXECUTE FUNCTION update_updated_at_column();</w:t>
+      </w:r>
+    </w:p>
+    <w:p>
+      <w:pPr>
+        <w:rPr>
+          <w:lang w:val="en-US"/>
+        </w:rPr>
+      </w:pPr>
+      <w:r>
+        <w:rPr>
+          <w:lang w:val="en-US"/>
+        </w:rPr>
+        <w:t>CREATE TRIGGER update_exercise_likes_updated_at BEFORE UPDATE ON exercise_likes FOR EACH ROW EXECUTE FUNCTION update_updated_at_column();</w:t>
+      </w:r>
+    </w:p>
+    <w:p>
+      <w:pPr>
+        <w:rPr>
+          <w:lang w:val="en-US"/>
+        </w:rPr>
+      </w:pPr>
+    </w:p>
+    <w:p>
+      <w:r>
+        <w:t>-- =====================================================</w:t>
+      </w:r>
+    </w:p>
+    <w:p>
+      <w:r>
+        <w:t>-- 6. БАЗОВЫЕ ДАННЫЕ (упражнения, шаблоны, программы)</w:t>
       </w:r>
     </w:p>
     <w:p>
@@ -2820,180 +3045,140 @@
           <w:lang w:val="en-US"/>
         </w:rPr>
         <w:lastRenderedPageBreak/>
-        <w:t>CREATE OR REPLACE FUNCTION update_updated_at_column()</w:t>
-      </w:r>
-    </w:p>
-    <w:p>
-      <w:pPr>
-        <w:rPr>
-          <w:lang w:val="en-US"/>
-        </w:rPr>
-      </w:pPr>
-      <w:r>
-        <w:rPr>
-          <w:lang w:val="en-US"/>
-        </w:rPr>
-        <w:t>RETURNS TRIGGER AS $$</w:t>
-      </w:r>
-    </w:p>
-    <w:p>
-      <w:pPr>
-        <w:rPr>
-          <w:lang w:val="en-US"/>
-        </w:rPr>
-      </w:pPr>
-      <w:r>
-        <w:rPr>
-          <w:lang w:val="en-US"/>
-        </w:rPr>
-        <w:t>BEGIN</w:t>
-      </w:r>
-    </w:p>
-    <w:p>
-      <w:pPr>
-        <w:rPr>
-          <w:lang w:val="en-US"/>
-        </w:rPr>
-      </w:pPr>
-      <w:r>
-        <w:rPr>
-          <w:lang w:val="en-US"/>
-        </w:rPr>
-        <w:t xml:space="preserve">    NEW.updated_at = CURRENT_TIMESTAMP;</w:t>
-      </w:r>
-    </w:p>
-    <w:p>
-      <w:pPr>
-        <w:rPr>
-          <w:lang w:val="en-US"/>
-        </w:rPr>
-      </w:pPr>
-      <w:r>
-        <w:rPr>
-          <w:lang w:val="en-US"/>
-        </w:rPr>
-        <w:t xml:space="preserve">    RETURN NEW;</w:t>
-      </w:r>
-    </w:p>
-    <w:p>
-      <w:pPr>
-        <w:rPr>
-          <w:lang w:val="en-US"/>
-        </w:rPr>
-      </w:pPr>
-      <w:r>
-        <w:rPr>
-          <w:lang w:val="en-US"/>
-        </w:rPr>
-        <w:t>END;</w:t>
-      </w:r>
-    </w:p>
-    <w:p>
-      <w:pPr>
-        <w:rPr>
-          <w:lang w:val="en-US"/>
-        </w:rPr>
-      </w:pPr>
-      <w:r>
-        <w:rPr>
-          <w:lang w:val="en-US"/>
-        </w:rPr>
-        <w:t>$$ language 'plpgsql';</w:t>
-      </w:r>
-    </w:p>
-    <w:p>
-      <w:pPr>
-        <w:rPr>
-          <w:lang w:val="en-US"/>
-        </w:rPr>
-      </w:pPr>
-    </w:p>
-    <w:p>
-      <w:pPr>
-        <w:rPr>
-          <w:lang w:val="en-US"/>
-        </w:rPr>
-      </w:pPr>
-      <w:r>
-        <w:rPr>
-          <w:lang w:val="en-US"/>
-        </w:rPr>
-        <w:t>CREATE TRIGGER update_users_updated_at BEFORE UPDATE ON users FOR EACH ROW EXECUTE FUNCTION update_updated_at_column();</w:t>
-      </w:r>
-    </w:p>
-    <w:p>
-      <w:pPr>
-        <w:rPr>
-          <w:lang w:val="en-US"/>
-        </w:rPr>
-      </w:pPr>
-      <w:r>
-        <w:rPr>
-          <w:lang w:val="en-US"/>
-        </w:rPr>
-        <w:t>CREATE TRIGGER update_workouts_updated_at BEFORE UPDATE ON workouts FOR EACH ROW EXECUTE FUNCTION update_updated_at_column();</w:t>
-      </w:r>
-    </w:p>
-    <w:p>
-      <w:pPr>
-        <w:rPr>
-          <w:lang w:val="en-US"/>
-        </w:rPr>
-      </w:pPr>
-      <w:r>
-        <w:rPr>
-          <w:lang w:val="en-US"/>
-        </w:rPr>
-        <w:t>CREATE TRIGGER update_exercises_updated_at BEFORE UPDATE ON exercises FOR EACH ROW EXECUTE FUNCTION update_updated_at_column();</w:t>
-      </w:r>
-    </w:p>
-    <w:p>
-      <w:pPr>
-        <w:rPr>
-          <w:lang w:val="en-US"/>
-        </w:rPr>
-      </w:pPr>
-      <w:r>
-        <w:rPr>
-          <w:lang w:val="en-US"/>
-        </w:rPr>
-        <w:t>CREATE TRIGGER update_user_workouts_updated_at BEFORE UPDATE ON user_workouts FOR EACH ROW EXECUTE FUNCTION update_updated_at_column();</w:t>
-      </w:r>
-    </w:p>
-    <w:p>
-      <w:pPr>
-        <w:rPr>
-          <w:lang w:val="en-US"/>
-        </w:rPr>
-      </w:pPr>
-    </w:p>
-    <w:p>
-      <w:pPr>
-        <w:rPr>
-          <w:lang w:val="en-US"/>
-        </w:rPr>
-      </w:pPr>
-      <w:r>
-        <w:rPr>
-          <w:lang w:val="en-US"/>
-        </w:rPr>
-        <w:t>-- ============================================</w:t>
-      </w:r>
-    </w:p>
-    <w:p>
-      <w:pPr>
-        <w:rPr>
-          <w:lang w:val="en-US"/>
-        </w:rPr>
-      </w:pPr>
-      <w:r>
-        <w:rPr>
-          <w:lang w:val="en-US"/>
-        </w:rPr>
-        <w:t xml:space="preserve">-- 6. </w:t>
-      </w:r>
-      <w:r>
-        <w:t>БАЗОВЫЕ</w:t>
+        <w:t>-- =====================================================</w:t>
+      </w:r>
+    </w:p>
+    <w:p>
+      <w:pPr>
+        <w:rPr>
+          <w:lang w:val="en-US"/>
+        </w:rPr>
+      </w:pPr>
+    </w:p>
+    <w:p>
+      <w:pPr>
+        <w:rPr>
+          <w:lang w:val="en-US"/>
+        </w:rPr>
+      </w:pPr>
+      <w:r>
+        <w:rPr>
+          <w:lang w:val="en-US"/>
+        </w:rPr>
+        <w:t xml:space="preserve">-- </w:t>
+      </w:r>
+      <w:r>
+        <w:t>Упражнения</w:t>
+      </w:r>
+    </w:p>
+    <w:p>
+      <w:pPr>
+        <w:rPr>
+          <w:lang w:val="en-US"/>
+        </w:rPr>
+      </w:pPr>
+      <w:r>
+        <w:rPr>
+          <w:lang w:val="en-US"/>
+        </w:rPr>
+        <w:t>INSERT INTO exercises (id, name, description, muscle_group, equipment_type) VALUES</w:t>
+      </w:r>
+    </w:p>
+    <w:p>
+      <w:r>
+        <w:t>(1, 'Приседания со штангой', 'Базовое упражнение для ног.', 'legs', 'barbell'),</w:t>
+      </w:r>
+    </w:p>
+    <w:p>
+      <w:r>
+        <w:t>(2, 'Выпады', 'Упражнение для ног с собственным весом.', 'legs', 'bodyweight'),</w:t>
+      </w:r>
+    </w:p>
+    <w:p>
+      <w:r>
+        <w:t>(3, 'Подъём на носки', 'Упражнение для икроножных мышц.', 'legs', 'bodyweight'),</w:t>
+      </w:r>
+    </w:p>
+    <w:p>
+      <w:r>
+        <w:t>(4, 'Становая тяга', 'Базовое упражнение для задней цепи.', 'legs', 'barbell'),</w:t>
+      </w:r>
+    </w:p>
+    <w:p>
+      <w:r>
+        <w:t>(5, 'Жим лёжа', 'Базовое упражнение для грудных мышц.', 'chest', 'barbell'),</w:t>
+      </w:r>
+    </w:p>
+    <w:p>
+      <w:r>
+        <w:t>(6, 'Отжимания', 'Упражнение для груди с собственным весом.', 'chest', 'bodyweight'),</w:t>
+      </w:r>
+    </w:p>
+    <w:p>
+      <w:r>
+        <w:t>(7, 'Жим гантелей', 'Упражнение для груди с гантелями.', 'chest', 'dumbbell'),</w:t>
+      </w:r>
+    </w:p>
+    <w:p>
+      <w:r>
+        <w:t>(8, 'Тяга штанги в наклоне', 'Упражнение для широчайших мышц спины.', 'back', 'barbell'),</w:t>
+      </w:r>
+    </w:p>
+    <w:p>
+      <w:r>
+        <w:t>(9, 'Подтягивания', 'Базовое упражнение для спины.', 'back', 'bodyweight'),</w:t>
+      </w:r>
+    </w:p>
+    <w:p>
+      <w:r>
+        <w:t>(10, 'Тяга верхнего блока', 'Упражнение для спины на тренажёре.', 'back', 'cable'),</w:t>
+      </w:r>
+    </w:p>
+    <w:p>
+      <w:r>
+        <w:t>(11, 'Жим над головой', 'Базовое упражнение для плеч.', 'shoulders', 'barbell'),</w:t>
+      </w:r>
+    </w:p>
+    <w:p>
+      <w:r>
+        <w:t>(12, 'Махи гантелями в стороны', 'Изолирующее упражнение для средних дельт.', 'shoulders', 'dumbbell'),</w:t>
+      </w:r>
+    </w:p>
+    <w:p>
+      <w:r>
+        <w:t>(13, 'Подъём на бицепс', 'Упражнение для бицепса.', 'arms', 'barbell'),</w:t>
+      </w:r>
+    </w:p>
+    <w:p>
+      <w:r>
+        <w:t>(14, 'Французский жим', 'Упражнение для трицепса.', 'arms', 'barbell'),</w:t>
+      </w:r>
+    </w:p>
+    <w:p>
+      <w:r>
+        <w:t>(15, 'Планка', 'Статическое упражнение для кора.', 'core', 'bodyweight'),</w:t>
+      </w:r>
+    </w:p>
+    <w:p>
+      <w:r>
+        <w:t>(16, 'Скручивания', 'Упражнение для прямой мышцы живота.', 'core', 'bodyweight');</w:t>
+      </w:r>
+    </w:p>
+    <w:p/>
+    <w:p>
+      <w:pPr>
+        <w:rPr>
+          <w:lang w:val="en-US"/>
+        </w:rPr>
+      </w:pPr>
+      <w:r>
+        <w:rPr>
+          <w:lang w:val="en-US"/>
+        </w:rPr>
+        <w:t xml:space="preserve">-- </w:t>
+      </w:r>
+      <w:r>
+        <w:t>Шаблоны</w:t>
       </w:r>
       <w:r>
         <w:rPr>
@@ -3002,20 +3187,229 @@
         <w:t xml:space="preserve"> </w:t>
       </w:r>
       <w:r>
-        <w:t>ДАННЫЕ</w:t>
-      </w:r>
-    </w:p>
-    <w:p>
-      <w:pPr>
-        <w:rPr>
-          <w:lang w:val="en-US"/>
-        </w:rPr>
-      </w:pPr>
-      <w:r>
-        <w:rPr>
-          <w:lang w:val="en-US"/>
-        </w:rPr>
-        <w:t>-- ============================================</w:t>
+        <w:t>метрик</w:t>
+      </w:r>
+    </w:p>
+    <w:p>
+      <w:pPr>
+        <w:rPr>
+          <w:lang w:val="en-US"/>
+        </w:rPr>
+      </w:pPr>
+      <w:r>
+        <w:rPr>
+          <w:lang w:val="en-US"/>
+        </w:rPr>
+        <w:t>INSERT INTO exercise_metric_templates (exercise_id, metric_type, required, default_value, unit) VALUES</w:t>
+      </w:r>
+    </w:p>
+    <w:p>
+      <w:pPr>
+        <w:rPr>
+          <w:lang w:val="en-US"/>
+        </w:rPr>
+      </w:pPr>
+      <w:r>
+        <w:rPr>
+          <w:lang w:val="en-US"/>
+        </w:rPr>
+        <w:t>(1, 'reps', true, 10, 'count'), (1, 'weight', true, 80, 'kg'),</w:t>
+      </w:r>
+    </w:p>
+    <w:p>
+      <w:pPr>
+        <w:rPr>
+          <w:lang w:val="en-US"/>
+        </w:rPr>
+      </w:pPr>
+      <w:r>
+        <w:rPr>
+          <w:lang w:val="en-US"/>
+        </w:rPr>
+        <w:t>(4, 'reps', true, 8, 'count'), (4, 'weight', true, 100, 'kg'),</w:t>
+      </w:r>
+    </w:p>
+    <w:p>
+      <w:pPr>
+        <w:rPr>
+          <w:lang w:val="en-US"/>
+        </w:rPr>
+      </w:pPr>
+      <w:r>
+        <w:rPr>
+          <w:lang w:val="en-US"/>
+        </w:rPr>
+        <w:t>(5, 'reps', true, 10, 'count'), (5, 'weight', true, 60, 'kg'),</w:t>
+      </w:r>
+    </w:p>
+    <w:p>
+      <w:pPr>
+        <w:rPr>
+          <w:lang w:val="en-US"/>
+        </w:rPr>
+      </w:pPr>
+      <w:r>
+        <w:rPr>
+          <w:lang w:val="en-US"/>
+        </w:rPr>
+        <w:t>(7, 'reps', true, 10, 'count'), (7, 'weight', true, 40, 'kg'),</w:t>
+      </w:r>
+    </w:p>
+    <w:p>
+      <w:pPr>
+        <w:rPr>
+          <w:lang w:val="en-US"/>
+        </w:rPr>
+      </w:pPr>
+      <w:r>
+        <w:rPr>
+          <w:lang w:val="en-US"/>
+        </w:rPr>
+        <w:t>(8, 'reps', true, 10, 'count'), (8, 'weight', true, 50, 'kg'),</w:t>
+      </w:r>
+    </w:p>
+    <w:p>
+      <w:pPr>
+        <w:rPr>
+          <w:lang w:val="en-US"/>
+        </w:rPr>
+      </w:pPr>
+      <w:r>
+        <w:rPr>
+          <w:lang w:val="en-US"/>
+        </w:rPr>
+        <w:t>(10, 'reps', true, 10, 'count'), (10, 'weight', true, 45, 'kg'),</w:t>
+      </w:r>
+    </w:p>
+    <w:p>
+      <w:pPr>
+        <w:rPr>
+          <w:lang w:val="en-US"/>
+        </w:rPr>
+      </w:pPr>
+      <w:r>
+        <w:rPr>
+          <w:lang w:val="en-US"/>
+        </w:rPr>
+        <w:t>(11, 'reps', true, 10, 'count'), (11, 'weight', true, 40, 'kg'),</w:t>
+      </w:r>
+    </w:p>
+    <w:p>
+      <w:pPr>
+        <w:rPr>
+          <w:lang w:val="en-US"/>
+        </w:rPr>
+      </w:pPr>
+      <w:r>
+        <w:rPr>
+          <w:lang w:val="en-US"/>
+        </w:rPr>
+        <w:t>(12, 'reps', true, 12, 'count'), (12, 'weight', true, 20, 'kg'),</w:t>
+      </w:r>
+    </w:p>
+    <w:p>
+      <w:pPr>
+        <w:rPr>
+          <w:lang w:val="en-US"/>
+        </w:rPr>
+      </w:pPr>
+      <w:r>
+        <w:rPr>
+          <w:lang w:val="en-US"/>
+        </w:rPr>
+        <w:lastRenderedPageBreak/>
+        <w:t>(13, 'reps', true, 10, 'count'), (13, 'weight', true, 30, 'kg'),</w:t>
+      </w:r>
+    </w:p>
+    <w:p>
+      <w:pPr>
+        <w:rPr>
+          <w:lang w:val="en-US"/>
+        </w:rPr>
+      </w:pPr>
+      <w:r>
+        <w:rPr>
+          <w:lang w:val="en-US"/>
+        </w:rPr>
+        <w:t>(14, 'reps', true, 10, 'count'), (14, 'weight', true, 25, 'kg'),</w:t>
+      </w:r>
+    </w:p>
+    <w:p>
+      <w:pPr>
+        <w:rPr>
+          <w:lang w:val="en-US"/>
+        </w:rPr>
+      </w:pPr>
+      <w:r>
+        <w:rPr>
+          <w:lang w:val="en-US"/>
+        </w:rPr>
+        <w:t>(2, 'reps', true, 12, 'count'),</w:t>
+      </w:r>
+    </w:p>
+    <w:p>
+      <w:pPr>
+        <w:rPr>
+          <w:lang w:val="en-US"/>
+        </w:rPr>
+      </w:pPr>
+      <w:r>
+        <w:rPr>
+          <w:lang w:val="en-US"/>
+        </w:rPr>
+        <w:t>(3, 'reps', true, 15, 'count'),</w:t>
+      </w:r>
+    </w:p>
+    <w:p>
+      <w:pPr>
+        <w:rPr>
+          <w:lang w:val="en-US"/>
+        </w:rPr>
+      </w:pPr>
+      <w:r>
+        <w:rPr>
+          <w:lang w:val="en-US"/>
+        </w:rPr>
+        <w:t>(6, 'reps', true, 15, 'count'),</w:t>
+      </w:r>
+    </w:p>
+    <w:p>
+      <w:pPr>
+        <w:rPr>
+          <w:lang w:val="en-US"/>
+        </w:rPr>
+      </w:pPr>
+      <w:r>
+        <w:rPr>
+          <w:lang w:val="en-US"/>
+        </w:rPr>
+        <w:t>(9, 'reps', true, 8, 'count'),</w:t>
+      </w:r>
+    </w:p>
+    <w:p>
+      <w:pPr>
+        <w:rPr>
+          <w:lang w:val="en-US"/>
+        </w:rPr>
+      </w:pPr>
+      <w:r>
+        <w:rPr>
+          <w:lang w:val="en-US"/>
+        </w:rPr>
+        <w:t>(16, 'reps', true, 20, 'count'),</w:t>
+      </w:r>
+    </w:p>
+    <w:p>
+      <w:pPr>
+        <w:rPr>
+          <w:lang w:val="en-US"/>
+        </w:rPr>
+      </w:pPr>
+      <w:r>
+        <w:rPr>
+          <w:lang w:val="en-US"/>
+        </w:rPr>
+        <w:t>(15, 'duration', true, 60, 'sec');</w:t>
       </w:r>
     </w:p>
     <w:p>
@@ -3038,374 +3432,7 @@
         <w:t xml:space="preserve">-- </w:t>
       </w:r>
       <w:r>
-        <w:t>Упражнения</w:t>
-      </w:r>
-    </w:p>
-    <w:p>
-      <w:pPr>
-        <w:rPr>
-          <w:lang w:val="en-US"/>
-        </w:rPr>
-      </w:pPr>
-      <w:r>
-        <w:rPr>
-          <w:lang w:val="en-US"/>
-        </w:rPr>
-        <w:t>INSERT INTO exercises (id, name, description, muscle_group, equipment_type) VALUES</w:t>
-      </w:r>
-    </w:p>
-    <w:p>
-      <w:r>
-        <w:t>(1, 'Приседания со штангой', 'Базовое упражнение для ног.', '</w:t>
-      </w:r>
-      <w:proofErr w:type="spellStart"/>
-      <w:r>
-        <w:t>legs</w:t>
-      </w:r>
-      <w:proofErr w:type="spellEnd"/>
-      <w:r>
-        <w:t>', '</w:t>
-      </w:r>
-      <w:proofErr w:type="spellStart"/>
-      <w:r>
-        <w:t>barbell</w:t>
-      </w:r>
-      <w:proofErr w:type="spellEnd"/>
-      <w:r>
-        <w:t>'),</w:t>
-      </w:r>
-    </w:p>
-    <w:p>
-      <w:r>
-        <w:t>(2, 'Выпады', 'Упражнение для ног с собственным весом.', '</w:t>
-      </w:r>
-      <w:proofErr w:type="spellStart"/>
-      <w:r>
-        <w:t>legs</w:t>
-      </w:r>
-      <w:proofErr w:type="spellEnd"/>
-      <w:r>
-        <w:t>', '</w:t>
-      </w:r>
-      <w:proofErr w:type="spellStart"/>
-      <w:r>
-        <w:t>bodyweight</w:t>
-      </w:r>
-      <w:proofErr w:type="spellEnd"/>
-      <w:r>
-        <w:t>'),</w:t>
-      </w:r>
-    </w:p>
-    <w:p>
-      <w:r>
-        <w:t>(3, 'Подъём на носки', 'Упражнение для икроножных мышц.', '</w:t>
-      </w:r>
-      <w:proofErr w:type="spellStart"/>
-      <w:r>
-        <w:t>legs</w:t>
-      </w:r>
-      <w:proofErr w:type="spellEnd"/>
-      <w:r>
-        <w:t>', '</w:t>
-      </w:r>
-      <w:proofErr w:type="spellStart"/>
-      <w:r>
-        <w:t>bodyweight</w:t>
-      </w:r>
-      <w:proofErr w:type="spellEnd"/>
-      <w:r>
-        <w:t>'),</w:t>
-      </w:r>
-    </w:p>
-    <w:p>
-      <w:r>
-        <w:t>(4, 'Становая тяга', 'Базовое упражнение для задней цепи.', '</w:t>
-      </w:r>
-      <w:proofErr w:type="spellStart"/>
-      <w:r>
-        <w:t>legs</w:t>
-      </w:r>
-      <w:proofErr w:type="spellEnd"/>
-      <w:r>
-        <w:t>', '</w:t>
-      </w:r>
-      <w:proofErr w:type="spellStart"/>
-      <w:r>
-        <w:t>barbell</w:t>
-      </w:r>
-      <w:proofErr w:type="spellEnd"/>
-      <w:r>
-        <w:t>'),</w:t>
-      </w:r>
-    </w:p>
-    <w:p>
-      <w:r>
-        <w:t>(5, 'Жим лёжа', 'Базовое упражнение для грудных мышц.', '</w:t>
-      </w:r>
-      <w:proofErr w:type="spellStart"/>
-      <w:r>
-        <w:t>chest</w:t>
-      </w:r>
-      <w:proofErr w:type="spellEnd"/>
-      <w:r>
-        <w:t>', '</w:t>
-      </w:r>
-      <w:proofErr w:type="spellStart"/>
-      <w:r>
-        <w:t>barbell</w:t>
-      </w:r>
-      <w:proofErr w:type="spellEnd"/>
-      <w:r>
-        <w:t>'),</w:t>
-      </w:r>
-    </w:p>
-    <w:p>
-      <w:r>
-        <w:t>(6, 'Отжимания', 'Упражнение для груди с собственным весом.', '</w:t>
-      </w:r>
-      <w:proofErr w:type="spellStart"/>
-      <w:r>
-        <w:t>chest</w:t>
-      </w:r>
-      <w:proofErr w:type="spellEnd"/>
-      <w:r>
-        <w:t>', '</w:t>
-      </w:r>
-      <w:proofErr w:type="spellStart"/>
-      <w:r>
-        <w:t>bodyweight</w:t>
-      </w:r>
-      <w:proofErr w:type="spellEnd"/>
-      <w:r>
-        <w:t>'),</w:t>
-      </w:r>
-    </w:p>
-    <w:p>
-      <w:r>
-        <w:t>(7, 'Жим гантелей', 'Упражнение для груди с гантелями.', '</w:t>
-      </w:r>
-      <w:proofErr w:type="spellStart"/>
-      <w:r>
-        <w:t>chest</w:t>
-      </w:r>
-      <w:proofErr w:type="spellEnd"/>
-      <w:r>
-        <w:t>', '</w:t>
-      </w:r>
-      <w:proofErr w:type="spellStart"/>
-      <w:r>
-        <w:t>dumbbell</w:t>
-      </w:r>
-      <w:proofErr w:type="spellEnd"/>
-      <w:r>
-        <w:t>'),</w:t>
-      </w:r>
-    </w:p>
-    <w:p>
-      <w:r>
-        <w:t>(8, 'Тяга штанги в наклоне', 'Упражнение для широчайших мышц спины.', '</w:t>
-      </w:r>
-      <w:proofErr w:type="spellStart"/>
-      <w:r>
-        <w:t>back</w:t>
-      </w:r>
-      <w:proofErr w:type="spellEnd"/>
-      <w:r>
-        <w:t>', '</w:t>
-      </w:r>
-      <w:proofErr w:type="spellStart"/>
-      <w:r>
-        <w:t>barbell</w:t>
-      </w:r>
-      <w:proofErr w:type="spellEnd"/>
-      <w:r>
-        <w:t>'),</w:t>
-      </w:r>
-    </w:p>
-    <w:p>
-      <w:r>
-        <w:t>(9, 'Подтягивания', 'Базовое упражнение для спины.', '</w:t>
-      </w:r>
-      <w:proofErr w:type="spellStart"/>
-      <w:r>
-        <w:t>back</w:t>
-      </w:r>
-      <w:proofErr w:type="spellEnd"/>
-      <w:r>
-        <w:t>', '</w:t>
-      </w:r>
-      <w:proofErr w:type="spellStart"/>
-      <w:r>
-        <w:t>bodyweight</w:t>
-      </w:r>
-      <w:proofErr w:type="spellEnd"/>
-      <w:r>
-        <w:t>'),</w:t>
-      </w:r>
-    </w:p>
-    <w:p>
-      <w:r>
-        <w:t>(10, 'Тяга верхнего блока', 'Упражнение для спины на тренажёре.', '</w:t>
-      </w:r>
-      <w:proofErr w:type="spellStart"/>
-      <w:r>
-        <w:t>back</w:t>
-      </w:r>
-      <w:proofErr w:type="spellEnd"/>
-      <w:r>
-        <w:t>', '</w:t>
-      </w:r>
-      <w:proofErr w:type="spellStart"/>
-      <w:r>
-        <w:t>cable</w:t>
-      </w:r>
-      <w:proofErr w:type="spellEnd"/>
-      <w:r>
-        <w:t>'),</w:t>
-      </w:r>
-    </w:p>
-    <w:p>
-      <w:r>
-        <w:t>(11, 'Жим над головой', 'Базовое упражнение для плеч.', '</w:t>
-      </w:r>
-      <w:proofErr w:type="spellStart"/>
-      <w:r>
-        <w:t>shoulders</w:t>
-      </w:r>
-      <w:proofErr w:type="spellEnd"/>
-      <w:r>
-        <w:t>', '</w:t>
-      </w:r>
-      <w:proofErr w:type="spellStart"/>
-      <w:r>
-        <w:t>barbell</w:t>
-      </w:r>
-      <w:proofErr w:type="spellEnd"/>
-      <w:r>
-        <w:t>'),</w:t>
-      </w:r>
-    </w:p>
-    <w:p>
-      <w:r>
-        <w:lastRenderedPageBreak/>
-        <w:t>(12, 'Махи гантелями в стороны', 'Изолирующее упражнение для средних дельт.', '</w:t>
-      </w:r>
-      <w:proofErr w:type="spellStart"/>
-      <w:r>
-        <w:t>shoulders</w:t>
-      </w:r>
-      <w:proofErr w:type="spellEnd"/>
-      <w:r>
-        <w:t>', '</w:t>
-      </w:r>
-      <w:proofErr w:type="spellStart"/>
-      <w:r>
-        <w:t>dumbbell</w:t>
-      </w:r>
-      <w:proofErr w:type="spellEnd"/>
-      <w:r>
-        <w:t>'),</w:t>
-      </w:r>
-    </w:p>
-    <w:p>
-      <w:r>
-        <w:t>(13, 'Подъём на бицепс', 'Упражнение для бицепса.', '</w:t>
-      </w:r>
-      <w:proofErr w:type="spellStart"/>
-      <w:r>
-        <w:t>arms</w:t>
-      </w:r>
-      <w:proofErr w:type="spellEnd"/>
-      <w:r>
-        <w:t>', '</w:t>
-      </w:r>
-      <w:proofErr w:type="spellStart"/>
-      <w:r>
-        <w:t>barbell</w:t>
-      </w:r>
-      <w:proofErr w:type="spellEnd"/>
-      <w:r>
-        <w:t>'),</w:t>
-      </w:r>
-    </w:p>
-    <w:p>
-      <w:r>
-        <w:t>(14, 'Французский жим', 'Упражнение для трицепса.', '</w:t>
-      </w:r>
-      <w:proofErr w:type="spellStart"/>
-      <w:r>
-        <w:t>arms</w:t>
-      </w:r>
-      <w:proofErr w:type="spellEnd"/>
-      <w:r>
-        <w:t>', '</w:t>
-      </w:r>
-      <w:proofErr w:type="spellStart"/>
-      <w:r>
-        <w:t>barbell</w:t>
-      </w:r>
-      <w:proofErr w:type="spellEnd"/>
-      <w:r>
-        <w:t>'),</w:t>
-      </w:r>
-    </w:p>
-    <w:p>
-      <w:r>
-        <w:t>(15, 'Планка', 'Статическое упражнение для кора.', '</w:t>
-      </w:r>
-      <w:proofErr w:type="spellStart"/>
-      <w:r>
-        <w:t>core</w:t>
-      </w:r>
-      <w:proofErr w:type="spellEnd"/>
-      <w:r>
-        <w:t>', '</w:t>
-      </w:r>
-      <w:proofErr w:type="spellStart"/>
-      <w:r>
-        <w:t>bodyweight</w:t>
-      </w:r>
-      <w:proofErr w:type="spellEnd"/>
-      <w:r>
-        <w:t>'),</w:t>
-      </w:r>
-    </w:p>
-    <w:p>
-      <w:r>
-        <w:t>(16, 'Скручивания', 'Упражнение для прямой мышцы живота.', '</w:t>
-      </w:r>
-      <w:proofErr w:type="spellStart"/>
-      <w:r>
-        <w:t>core</w:t>
-      </w:r>
-      <w:proofErr w:type="spellEnd"/>
-      <w:r>
-        <w:t>', '</w:t>
-      </w:r>
-      <w:proofErr w:type="spellStart"/>
-      <w:r>
-        <w:t>bodyweight</w:t>
-      </w:r>
-      <w:proofErr w:type="spellEnd"/>
-      <w:r>
-        <w:t>');</w:t>
-      </w:r>
-    </w:p>
-    <w:p/>
-    <w:p>
-      <w:pPr>
-        <w:rPr>
-          <w:lang w:val="en-US"/>
-        </w:rPr>
-      </w:pPr>
-      <w:r>
-        <w:rPr>
-          <w:lang w:val="en-US"/>
-        </w:rPr>
-        <w:t xml:space="preserve">-- </w:t>
-      </w:r>
-      <w:r>
-        <w:t>Шаблоны</w:t>
+        <w:t>Программы</w:t>
       </w:r>
       <w:r>
         <w:rPr>
@@ -3414,259 +3441,6 @@
         <w:t xml:space="preserve"> </w:t>
       </w:r>
       <w:r>
-        <w:t>метрик</w:t>
-      </w:r>
-    </w:p>
-    <w:p>
-      <w:pPr>
-        <w:rPr>
-          <w:lang w:val="en-US"/>
-        </w:rPr>
-      </w:pPr>
-      <w:r>
-        <w:rPr>
-          <w:lang w:val="en-US"/>
-        </w:rPr>
-        <w:t>INSERT INTO exercise_metric_templates (exercise_id, metric_type, required, default_value, unit) VALUES</w:t>
-      </w:r>
-    </w:p>
-    <w:p>
-      <w:pPr>
-        <w:rPr>
-          <w:lang w:val="en-US"/>
-        </w:rPr>
-      </w:pPr>
-      <w:r>
-        <w:rPr>
-          <w:lang w:val="en-US"/>
-        </w:rPr>
-        <w:t>(1, 'reps', true, 10, 'count'), (1, 'weight', true, 80, 'kg'),</w:t>
-      </w:r>
-    </w:p>
-    <w:p>
-      <w:pPr>
-        <w:rPr>
-          <w:lang w:val="en-US"/>
-        </w:rPr>
-      </w:pPr>
-      <w:r>
-        <w:rPr>
-          <w:lang w:val="en-US"/>
-        </w:rPr>
-        <w:t>(4, 'reps', true, 8, 'count'), (4, 'weight', true, 100, 'kg'),</w:t>
-      </w:r>
-    </w:p>
-    <w:p>
-      <w:pPr>
-        <w:rPr>
-          <w:lang w:val="en-US"/>
-        </w:rPr>
-      </w:pPr>
-      <w:r>
-        <w:rPr>
-          <w:lang w:val="en-US"/>
-        </w:rPr>
-        <w:t>(5, 'reps', true, 10, 'count'), (5, 'weight', true, 60, 'kg'),</w:t>
-      </w:r>
-    </w:p>
-    <w:p>
-      <w:pPr>
-        <w:rPr>
-          <w:lang w:val="en-US"/>
-        </w:rPr>
-      </w:pPr>
-      <w:r>
-        <w:rPr>
-          <w:lang w:val="en-US"/>
-        </w:rPr>
-        <w:t>(7, 'reps', true, 10, 'count'), (7, 'weight', true, 40, 'kg'),</w:t>
-      </w:r>
-    </w:p>
-    <w:p>
-      <w:pPr>
-        <w:rPr>
-          <w:lang w:val="en-US"/>
-        </w:rPr>
-      </w:pPr>
-      <w:r>
-        <w:rPr>
-          <w:lang w:val="en-US"/>
-        </w:rPr>
-        <w:t>(8, 'reps', true, 10, 'count'), (8, 'weight', true, 50, 'kg'),</w:t>
-      </w:r>
-    </w:p>
-    <w:p>
-      <w:pPr>
-        <w:rPr>
-          <w:lang w:val="en-US"/>
-        </w:rPr>
-      </w:pPr>
-      <w:r>
-        <w:rPr>
-          <w:lang w:val="en-US"/>
-        </w:rPr>
-        <w:t>(10, 'reps', true, 10, 'count'), (10, 'weight', true, 45, 'kg'),</w:t>
-      </w:r>
-    </w:p>
-    <w:p>
-      <w:pPr>
-        <w:rPr>
-          <w:lang w:val="en-US"/>
-        </w:rPr>
-      </w:pPr>
-      <w:r>
-        <w:rPr>
-          <w:lang w:val="en-US"/>
-        </w:rPr>
-        <w:t>(11, 'reps', true, 10, 'count'), (11, 'weight', true, 40, 'kg'),</w:t>
-      </w:r>
-    </w:p>
-    <w:p>
-      <w:pPr>
-        <w:rPr>
-          <w:lang w:val="en-US"/>
-        </w:rPr>
-      </w:pPr>
-      <w:r>
-        <w:rPr>
-          <w:lang w:val="en-US"/>
-        </w:rPr>
-        <w:t>(12, 'reps', true, 12, 'count'), (12, 'weight', true, 20, 'kg'),</w:t>
-      </w:r>
-    </w:p>
-    <w:p>
-      <w:pPr>
-        <w:rPr>
-          <w:lang w:val="en-US"/>
-        </w:rPr>
-      </w:pPr>
-      <w:r>
-        <w:rPr>
-          <w:lang w:val="en-US"/>
-        </w:rPr>
-        <w:t>(13, 'reps', true, 10, 'count'), (13, 'weight', true, 30, 'kg'),</w:t>
-      </w:r>
-    </w:p>
-    <w:p>
-      <w:pPr>
-        <w:rPr>
-          <w:lang w:val="en-US"/>
-        </w:rPr>
-      </w:pPr>
-      <w:r>
-        <w:rPr>
-          <w:lang w:val="en-US"/>
-        </w:rPr>
-        <w:t>(14, 'reps', true, 10, 'count'), (14, 'weight', true, 25, 'kg'),</w:t>
-      </w:r>
-    </w:p>
-    <w:p>
-      <w:pPr>
-        <w:rPr>
-          <w:lang w:val="en-US"/>
-        </w:rPr>
-      </w:pPr>
-      <w:r>
-        <w:rPr>
-          <w:lang w:val="en-US"/>
-        </w:rPr>
-        <w:t>(2, 'reps', true, 12, 'count'),</w:t>
-      </w:r>
-    </w:p>
-    <w:p>
-      <w:pPr>
-        <w:rPr>
-          <w:lang w:val="en-US"/>
-        </w:rPr>
-      </w:pPr>
-      <w:r>
-        <w:rPr>
-          <w:lang w:val="en-US"/>
-        </w:rPr>
-        <w:t>(3, 'reps', true, 15, 'count'),</w:t>
-      </w:r>
-    </w:p>
-    <w:p>
-      <w:pPr>
-        <w:rPr>
-          <w:lang w:val="en-US"/>
-        </w:rPr>
-      </w:pPr>
-      <w:r>
-        <w:rPr>
-          <w:lang w:val="en-US"/>
-        </w:rPr>
-        <w:t>(6, 'reps', true, 15, 'count'),</w:t>
-      </w:r>
-    </w:p>
-    <w:p>
-      <w:pPr>
-        <w:rPr>
-          <w:lang w:val="en-US"/>
-        </w:rPr>
-      </w:pPr>
-      <w:r>
-        <w:rPr>
-          <w:lang w:val="en-US"/>
-        </w:rPr>
-        <w:t>(9, 'reps', true, 8, 'count'),</w:t>
-      </w:r>
-    </w:p>
-    <w:p>
-      <w:pPr>
-        <w:rPr>
-          <w:lang w:val="en-US"/>
-        </w:rPr>
-      </w:pPr>
-      <w:r>
-        <w:rPr>
-          <w:lang w:val="en-US"/>
-        </w:rPr>
-        <w:t>(16, 'reps', true, 20, 'count'),</w:t>
-      </w:r>
-    </w:p>
-    <w:p>
-      <w:pPr>
-        <w:rPr>
-          <w:lang w:val="en-US"/>
-        </w:rPr>
-      </w:pPr>
-      <w:r>
-        <w:rPr>
-          <w:lang w:val="en-US"/>
-        </w:rPr>
-        <w:t>(15, 'duration', true, 60, 'sec');</w:t>
-      </w:r>
-    </w:p>
-    <w:p>
-      <w:pPr>
-        <w:rPr>
-          <w:lang w:val="en-US"/>
-        </w:rPr>
-      </w:pPr>
-    </w:p>
-    <w:p>
-      <w:pPr>
-        <w:rPr>
-          <w:lang w:val="en-US"/>
-        </w:rPr>
-      </w:pPr>
-      <w:r>
-        <w:rPr>
-          <w:lang w:val="en-US"/>
-        </w:rPr>
-        <w:t xml:space="preserve">-- </w:t>
-      </w:r>
-      <w:r>
-        <w:t>Программы</w:t>
-      </w:r>
-      <w:r>
-        <w:rPr>
-          <w:lang w:val="en-US"/>
-        </w:rPr>
-        <w:t xml:space="preserve"> </w:t>
-      </w:r>
-      <w:r>
         <w:t>тренировок</w:t>
       </w:r>
     </w:p>
@@ -3726,7 +3500,6 @@
         <w:rPr>
           <w:lang w:val="en-US"/>
         </w:rPr>
-        <w:lastRenderedPageBreak/>
         <w:t xml:space="preserve">-- </w:t>
       </w:r>
       <w:r>

</xml_diff>